<commit_message>
Match export formatting to the source document
</commit_message>
<xml_diff>
--- a/export/reference/_template.docx
+++ b/export/reference/_template.docx
@@ -7666,18 +7666,14 @@
     <w:qFormat/>
     <w:pPr>
       <w:keepNext/>
-      <w:tabs>
-        <w:tab w:val="left" w:pos="440"/>
-      </w:tabs>
       <w:spacing w:before="240" w:after="120"/>
       <w:outlineLvl w:val="1"/>
     </w:pPr>
     <w:rPr>
       <w:b/>
-      <w:color w:val="545454"/>
-      <w:spacing w:val="-2"/>
-      <w:sz w:val="24"/>
-      <w:szCs w:val="24"/>
+      <w:color w:val="595959"/>
+      <w:sz w:val="30"/>
+      <w:szCs w:val="28"/>
     </w:rPr>
   </w:style>
   <w:style w:type="paragraph" w:styleId="Heading3">
@@ -7692,15 +7688,14 @@
         <w:tab w:val="left" w:pos="440"/>
       </w:tabs>
       <w:spacing w:before="240" w:after="120"/>
-      <w:outlineLvl w:val="2"/>
+      <w:outlineLvl w:val="9"/>
     </w:pPr>
     <w:rPr>
       <w:b/>
-      <w:i/>
-      <w:color w:val="C00000"/>
+      <w:color w:val="545454"/>
       <w:spacing w:val="-2"/>
       <w:sz w:val="24"/>
-      <w:szCs w:val="24"/>
+      <w:szCs w:val="22"/>
     </w:rPr>
   </w:style>
   <w:style w:type="paragraph" w:styleId="Heading4">
@@ -7711,13 +7706,18 @@
     <w:qFormat/>
     <w:pPr>
       <w:keepNext/>
-      <w:spacing w:before="200" w:after="100"/>
-      <w:outlineLvl w:val="3"/>
+      <w:tabs>
+        <w:tab w:val="left" w:pos="440"/>
+      </w:tabs>
+      <w:spacing w:before="240" w:after="120"/>
+      <w:outlineLvl w:val="9"/>
     </w:pPr>
     <w:rPr>
       <w:b/>
-      <w:color w:val="545454"/>
-      <w:sz w:val="22"/>
+      <w:i/>
+      <w:color w:val="C00000"/>
+      <w:spacing w:val="-2"/>
+      <w:sz w:val="24"/>
       <w:szCs w:val="22"/>
     </w:rPr>
   </w:style>
@@ -9662,12 +9662,16 @@
   </w:style>
   <w:style w:type="paragraph" w:customStyle="1" w:styleId="Compact">
     <w:name w:val="Compact"/>
-    <w:basedOn w:val="BodyText"/>
+    <w:basedOn w:val="Normal"/>
     <w:qFormat/>
     <w:pPr>
-      <w:spacing w:before="0" w:after="0"/>
+      <w:spacing w:before="20" w:after="20"/>
       <w:contextualSpacing/>
     </w:pPr>
+    <w:rPr>
+      <w:sz w:val="22"/>
+      <w:szCs w:val="22"/>
+    </w:rPr>
   </w:style>
   <w:style w:type="paragraph" w:customStyle="1" w:styleId="SourceCode">
     <w:name w:val="Source Code"/>
@@ -9746,6 +9750,16 @@
       </w:rPr>
       <w:tcPr>
         <w:shd w:val="clear" w:color="auto" w:fill="C00000"/>
+      </w:tcPr>
+    </w:tblStylePr>
+    <w:tblStylePr w:type="band1Horz">
+      <w:tcPr>
+        <w:shd w:val="clear" w:color="auto" w:fill="F2F2F2"/>
+      </w:tcPr>
+    </w:tblStylePr>
+    <w:tblStylePr w:type="band2Horz">
+      <w:tcPr>
+        <w:shd w:val="clear" w:color="auto" w:fill="FFFFFF"/>
       </w:tcPr>
     </w:tblStylePr>
   </w:style>

</xml_diff>